<commit_message>
Enhance marketing training manual with images and product context
Add 11 training visuals (live app screenshots and diagrams) and 10 new
sections covering platform walkthrough, nine AI agents, CHIS scoring,
India coverage, demo script, competitive differentiation, SDG alignment,
and open-source positioning. Include regeneration scripts and source assets.

Co-authored-by: carbonintelli <carbonintelli@users.noreply.github.com>
</commit_message>
<xml_diff>
--- a/Training/KlimaGuard_Kids_Marketing_Training_Manual.docx
+++ b/Training/KlimaGuard_Kids_Marketing_Training_Manual.docx
@@ -2,6 +2,46 @@
 <file path=word/document.xml><?xml version="1.0" encoding="utf-8"?>
 <w:document xmlns:wpc="http://schemas.microsoft.com/office/word/2010/wordprocessingCanvas" xmlns:mo="http://schemas.microsoft.com/office/mac/office/2008/main" xmlns:mc="http://schemas.openxmlformats.org/markup-compatibility/2006" xmlns:mv="urn:schemas-microsoft-com:mac:vml" xmlns:o="urn:schemas-microsoft-com:office:office" xmlns:r="http://schemas.openxmlformats.org/officeDocument/2006/relationships" xmlns:m="http://schemas.openxmlformats.org/officeDocument/2006/math" xmlns:v="urn:schemas-microsoft-com:vml" xmlns:wp14="http://schemas.microsoft.com/office/word/2010/wordprocessingDrawing" xmlns:wp="http://schemas.openxmlformats.org/drawingml/2006/wordprocessingDrawing" xmlns:w10="urn:schemas-microsoft-com:office:word" xmlns:w="http://schemas.openxmlformats.org/wordprocessingml/2006/main" xmlns:w14="http://schemas.microsoft.com/office/word/2010/wordml" xmlns:wpg="http://schemas.microsoft.com/office/word/2010/wordprocessingGroup" xmlns:wpi="http://schemas.microsoft.com/office/word/2010/wordprocessingInk" xmlns:wne="http://schemas.microsoft.com/office/word/2006/wordml" xmlns:wps="http://schemas.microsoft.com/office/word/2010/wordprocessingShape" mc:Ignorable="w14 wp14">
   <w:body>
+    <w:p>
+      <w:pPr>
+        <w:jc w:val="center"/>
+      </w:pPr>
+      <w:r>
+        <w:drawing>
+          <wp:inline xmlns:a="http://schemas.openxmlformats.org/drawingml/2006/main" xmlns:pic="http://schemas.openxmlformats.org/drawingml/2006/picture">
+            <wp:extent cx="1097280" cy="1097280"/>
+            <wp:docPr id="1" name="Picture 1"/>
+            <wp:cNvGraphicFramePr>
+              <a:graphicFrameLocks noChangeAspect="1"/>
+            </wp:cNvGraphicFramePr>
+            <a:graphic>
+              <a:graphicData uri="http://schemas.openxmlformats.org/drawingml/2006/picture">
+                <pic:pic>
+                  <pic:nvPicPr>
+                    <pic:cNvPr id="0" name="logo.png"/>
+                    <pic:cNvPicPr/>
+                  </pic:nvPicPr>
+                  <pic:blipFill>
+                    <a:blip r:embed="rId10"/>
+                    <a:stretch>
+                      <a:fillRect/>
+                    </a:stretch>
+                  </pic:blipFill>
+                  <pic:spPr>
+                    <a:xfrm>
+                      <a:off x="0" y="0"/>
+                      <a:ext cx="1097280" cy="1097280"/>
+                    </a:xfrm>
+                    <a:prstGeom prst="rect"/>
+                  </pic:spPr>
+                </pic:pic>
+              </a:graphicData>
+            </a:graphic>
+          </wp:inline>
+        </w:drawing>
+      </w:r>
+    </w:p>
+    <w:p/>
     <w:p>
       <w:pPr>
         <w:jc w:val="center"/>
@@ -123,6 +163,63 @@
       </w:pPr>
       <w:r>
         <w:t>2. Product Overview</w:t>
+      </w:r>
+    </w:p>
+    <w:p>
+      <w:r>
+        <w:t>Platform context: KlimaGuard Kids is an open-source (MIT) Next.js web application with live Open-Meteo integration, nine cooperating AI agents, 65 global countries, and 37 India regions. The live prototype includes home, global dashboard, India CHIS dashboard, kids health chat, and stakeholder pitch pages — all accessible without API keys for demonstration purposes.</w:t>
+      </w:r>
+    </w:p>
+    <w:p>
+      <w:pPr>
+        <w:jc w:val="center"/>
+      </w:pPr>
+      <w:r>
+        <w:drawing>
+          <wp:inline xmlns:a="http://schemas.openxmlformats.org/drawingml/2006/main" xmlns:pic="http://schemas.openxmlformats.org/drawingml/2006/picture">
+            <wp:extent cx="5029200" cy="1310740"/>
+            <wp:docPr id="12" name="Picture 12"/>
+            <wp:cNvGraphicFramePr>
+              <a:graphicFrameLocks noChangeAspect="1"/>
+            </wp:cNvGraphicFramePr>
+            <a:graphic>
+              <a:graphicData uri="http://schemas.openxmlformats.org/drawingml/2006/picture">
+                <pic:pic>
+                  <pic:nvPicPr>
+                    <pic:cNvPr id="0" name="image.png"/>
+                    <pic:cNvPicPr/>
+                  </pic:nvPicPr>
+                  <pic:blipFill>
+                    <a:blip r:embed="rId19"/>
+                    <a:stretch>
+                      <a:fillRect/>
+                    </a:stretch>
+                  </pic:blipFill>
+                  <pic:spPr>
+                    <a:xfrm>
+                      <a:off x="0" y="0"/>
+                      <a:ext cx="5029200" cy="1310740"/>
+                    </a:xfrm>
+                    <a:prstGeom prst="rect"/>
+                  </pic:spPr>
+                </pic:pic>
+              </a:graphicData>
+            </a:graphic>
+          </wp:inline>
+        </w:drawing>
+      </w:r>
+    </w:p>
+    <w:p>
+      <w:pPr>
+        <w:jc w:val="center"/>
+      </w:pPr>
+      <w:r>
+        <w:rPr>
+          <w:i/>
+          <w:color w:val="475569"/>
+          <w:sz w:val="18"/>
+        </w:rPr>
+        <w:t>Figure 2.1: High-level product flow — from live climate data to stakeholder decision support.</w:t>
       </w:r>
     </w:p>
     <w:p>
@@ -379,6 +476,58 @@
     </w:p>
     <w:p>
       <w:pPr>
+        <w:jc w:val="center"/>
+      </w:pPr>
+      <w:r>
+        <w:drawing>
+          <wp:inline xmlns:a="http://schemas.openxmlformats.org/drawingml/2006/main" xmlns:pic="http://schemas.openxmlformats.org/drawingml/2006/picture">
+            <wp:extent cx="5029200" cy="2915104"/>
+            <wp:docPr id="13" name="Picture 13"/>
+            <wp:cNvGraphicFramePr>
+              <a:graphicFrameLocks noChangeAspect="1"/>
+            </wp:cNvGraphicFramePr>
+            <a:graphic>
+              <a:graphicData uri="http://schemas.openxmlformats.org/drawingml/2006/picture">
+                <pic:pic>
+                  <pic:nvPicPr>
+                    <pic:cNvPr id="0" name="image.png"/>
+                    <pic:cNvPicPr/>
+                  </pic:nvPicPr>
+                  <pic:blipFill>
+                    <a:blip r:embed="rId16"/>
+                    <a:stretch>
+                      <a:fillRect/>
+                    </a:stretch>
+                  </pic:blipFill>
+                  <pic:spPr>
+                    <a:xfrm>
+                      <a:off x="0" y="0"/>
+                      <a:ext cx="5029200" cy="2915104"/>
+                    </a:xfrm>
+                    <a:prstGeom prst="rect"/>
+                  </pic:spPr>
+                </pic:pic>
+              </a:graphicData>
+            </a:graphic>
+          </wp:inline>
+        </w:drawing>
+      </w:r>
+    </w:p>
+    <w:p>
+      <w:pPr>
+        <w:jc w:val="center"/>
+      </w:pPr>
+      <w:r>
+        <w:rPr>
+          <w:i/>
+          <w:color w:val="475569"/>
+          <w:sz w:val="18"/>
+        </w:rPr>
+        <w:t>Figure 5.1: Nine-agent pipeline architecture — reference during the eight-step flow explanation.</w:t>
+      </w:r>
+    </w:p>
+    <w:p>
+      <w:pPr>
         <w:pStyle w:val="Heading2"/>
       </w:pPr>
       <w:r>
@@ -487,6 +636,11 @@
       </w:pPr>
       <w:r>
         <w:t>6. Climate-Health Fundamentals for Marketing Professionals</w:t>
+      </w:r>
+    </w:p>
+    <w:p>
+      <w:r>
+        <w:t>India-specific context: The India Child Health Impact Agent uses IMD heatwave thresholds, CPCB air quality categories, NFHS-5 child health baselines, and NVBDCP vector seasonality models. When discussing these concepts with Indian stakeholders, reference these authoritative sources to build credibility — but always clarify that the platform synthesizes public data into decision support, not clinical diagnoses.</w:t>
       </w:r>
     </w:p>
     <w:tbl>
@@ -686,6 +840,58 @@
     </w:p>
     <w:p>
       <w:pPr>
+        <w:jc w:val="center"/>
+      </w:pPr>
+      <w:r>
+        <w:drawing>
+          <wp:inline xmlns:a="http://schemas.openxmlformats.org/drawingml/2006/main" xmlns:pic="http://schemas.openxmlformats.org/drawingml/2006/picture">
+            <wp:extent cx="5029200" cy="2277064"/>
+            <wp:docPr id="14" name="Picture 14"/>
+            <wp:cNvGraphicFramePr>
+              <a:graphicFrameLocks noChangeAspect="1"/>
+            </wp:cNvGraphicFramePr>
+            <a:graphic>
+              <a:graphicData uri="http://schemas.openxmlformats.org/drawingml/2006/picture">
+                <pic:pic>
+                  <pic:nvPicPr>
+                    <pic:cNvPr id="0" name="image.png"/>
+                    <pic:cNvPicPr/>
+                  </pic:nvPicPr>
+                  <pic:blipFill>
+                    <a:blip r:embed="rId17"/>
+                    <a:stretch>
+                      <a:fillRect/>
+                    </a:stretch>
+                  </pic:blipFill>
+                  <pic:spPr>
+                    <a:xfrm>
+                      <a:off x="0" y="0"/>
+                      <a:ext cx="5029200" cy="2277064"/>
+                    </a:xfrm>
+                    <a:prstGeom prst="rect"/>
+                  </pic:spPr>
+                </pic:pic>
+              </a:graphicData>
+            </a:graphic>
+          </wp:inline>
+        </w:drawing>
+      </w:r>
+    </w:p>
+    <w:p>
+      <w:pPr>
+        <w:jc w:val="center"/>
+      </w:pPr>
+      <w:r>
+        <w:rPr>
+          <w:i/>
+          <w:color w:val="475569"/>
+          <w:sz w:val="18"/>
+        </w:rPr>
+        <w:t>Figure 7.1: CHIS composite score breakdown across five transparent dimensions.</w:t>
+      </w:r>
+    </w:p>
+    <w:p>
+      <w:pPr>
         <w:pStyle w:val="ListBullet"/>
       </w:pPr>
       <w:r>
@@ -730,6 +936,58 @@
       </w:pPr>
       <w:r>
         <w:t>8. Target Customer Profiles</w:t>
+      </w:r>
+    </w:p>
+    <w:p>
+      <w:pPr>
+        <w:jc w:val="center"/>
+      </w:pPr>
+      <w:r>
+        <w:drawing>
+          <wp:inline xmlns:a="http://schemas.openxmlformats.org/drawingml/2006/main" xmlns:pic="http://schemas.openxmlformats.org/drawingml/2006/picture">
+            <wp:extent cx="5029200" cy="2490598"/>
+            <wp:docPr id="15" name="Picture 15"/>
+            <wp:cNvGraphicFramePr>
+              <a:graphicFrameLocks noChangeAspect="1"/>
+            </wp:cNvGraphicFramePr>
+            <a:graphic>
+              <a:graphicData uri="http://schemas.openxmlformats.org/drawingml/2006/picture">
+                <pic:pic>
+                  <pic:nvPicPr>
+                    <pic:cNvPr id="0" name="image.png"/>
+                    <pic:cNvPicPr/>
+                  </pic:nvPicPr>
+                  <pic:blipFill>
+                    <a:blip r:embed="rId20"/>
+                    <a:stretch>
+                      <a:fillRect/>
+                    </a:stretch>
+                  </pic:blipFill>
+                  <pic:spPr>
+                    <a:xfrm>
+                      <a:off x="0" y="0"/>
+                      <a:ext cx="5029200" cy="2490598"/>
+                    </a:xfrm>
+                    <a:prstGeom prst="rect"/>
+                  </pic:spPr>
+                </pic:pic>
+              </a:graphicData>
+            </a:graphic>
+          </wp:inline>
+        </w:drawing>
+      </w:r>
+    </w:p>
+    <w:p>
+      <w:pPr>
+        <w:jc w:val="center"/>
+      </w:pPr>
+      <w:r>
+        <w:rPr>
+          <w:i/>
+          <w:color w:val="475569"/>
+          <w:sz w:val="18"/>
+        </w:rPr>
+        <w:t>Figure 8.1: Marketing funnel — align outreach stage to stakeholder readiness.</w:t>
       </w:r>
     </w:p>
     <w:tbl>
@@ -1795,6 +2053,11 @@
       </w:pPr>
       <w:r>
         <w:t>13. Email Marketing Training</w:t>
+      </w:r>
+    </w:p>
+    <w:p>
+      <w:r>
+        <w:t>Visual demo tip: Include a screenshot of the relevant dashboard (India CHIS for Indian schools, global dashboard for international NGOs) as an inline image or link to /india or /dashboard. Personalized visuals increase demo booking rates compared to text-only outreach.</w:t>
       </w:r>
     </w:p>
     <w:p>
@@ -4227,6 +4490,58 @@
       </w:r>
     </w:p>
     <w:p>
+      <w:pPr>
+        <w:jc w:val="center"/>
+      </w:pPr>
+      <w:r>
+        <w:drawing>
+          <wp:inline xmlns:a="http://schemas.openxmlformats.org/drawingml/2006/main" xmlns:pic="http://schemas.openxmlformats.org/drawingml/2006/picture">
+            <wp:extent cx="5029200" cy="2261986"/>
+            <wp:docPr id="16" name="Picture 16"/>
+            <wp:cNvGraphicFramePr>
+              <a:graphicFrameLocks noChangeAspect="1"/>
+            </wp:cNvGraphicFramePr>
+            <a:graphic>
+              <a:graphicData uri="http://schemas.openxmlformats.org/drawingml/2006/picture">
+                <pic:pic>
+                  <pic:nvPicPr>
+                    <pic:cNvPr id="0" name="image.png"/>
+                    <pic:cNvPicPr/>
+                  </pic:nvPicPr>
+                  <pic:blipFill>
+                    <a:blip r:embed="rId18"/>
+                    <a:stretch>
+                      <a:fillRect/>
+                    </a:stretch>
+                  </pic:blipFill>
+                  <pic:spPr>
+                    <a:xfrm>
+                      <a:off x="0" y="0"/>
+                      <a:ext cx="5029200" cy="2261986"/>
+                    </a:xfrm>
+                    <a:prstGeom prst="rect"/>
+                  </pic:spPr>
+                </pic:pic>
+              </a:graphicData>
+            </a:graphic>
+          </wp:inline>
+        </w:drawing>
+      </w:r>
+    </w:p>
+    <w:p>
+      <w:pPr>
+        <w:jc w:val="center"/>
+      </w:pPr>
+      <w:r>
+        <w:rPr>
+          <w:i/>
+          <w:color w:val="475569"/>
+          <w:sz w:val="18"/>
+        </w:rPr>
+        <w:t>Figure 25.1: India regional coverage — 37 Tier 1–3 cities for localized pitches.</w:t>
+      </w:r>
+    </w:p>
+    <w:p>
       <w:r>
         <w:t>Do not market KlimaGuard Kids as merely another weather application. Do not begin with fear-based messaging or unsupported health claims. Start with the stakeholder problem:</w:t>
       </w:r>
@@ -4278,6 +4593,1746 @@
         <w:t>Understand. Prepare. Protect. Act Responsibly.</w:t>
       </w:r>
     </w:p>
+    <w:p>
+      <w:r>
+        <w:br w:type="page"/>
+      </w:r>
+    </w:p>
+    <w:p>
+      <w:pPr>
+        <w:pStyle w:val="Heading1"/>
+      </w:pPr>
+      <w:r>
+        <w:rPr>
+          <w:color w:val="0EA5E9"/>
+        </w:rPr>
+        <w:t>26. Platform Visual Walkthrough</w:t>
+      </w:r>
+    </w:p>
+    <w:p>
+      <w:r>
+        <w:t>This section provides visual context from the live KlimaGuard Kids prototype. Use these screenshots during demos and training exercises to connect marketing language with actual product surfaces.</w:t>
+      </w:r>
+    </w:p>
+    <w:p>
+      <w:pPr>
+        <w:pStyle w:val="Heading2"/>
+      </w:pPr>
+      <w:r>
+        <w:rPr>
+          <w:color w:val="0EA5E9"/>
+        </w:rPr>
+        <w:t>26.1 Home Page — Product Entry Point</w:t>
+      </w:r>
+    </w:p>
+    <w:p>
+      <w:pPr>
+        <w:jc w:val="center"/>
+      </w:pPr>
+      <w:r>
+        <w:drawing>
+          <wp:inline xmlns:a="http://schemas.openxmlformats.org/drawingml/2006/main" xmlns:pic="http://schemas.openxmlformats.org/drawingml/2006/picture">
+            <wp:extent cx="5486400" cy="8113871"/>
+            <wp:docPr id="2" name="Picture 2"/>
+            <wp:cNvGraphicFramePr>
+              <a:graphicFrameLocks noChangeAspect="1"/>
+            </wp:cNvGraphicFramePr>
+            <a:graphic>
+              <a:graphicData uri="http://schemas.openxmlformats.org/drawingml/2006/picture">
+                <pic:pic>
+                  <pic:nvPicPr>
+                    <pic:cNvPr id="0" name="screenshot_home.png"/>
+                    <pic:cNvPicPr/>
+                  </pic:nvPicPr>
+                  <pic:blipFill>
+                    <a:blip r:embed="rId11"/>
+                    <a:stretch>
+                      <a:fillRect/>
+                    </a:stretch>
+                  </pic:blipFill>
+                  <pic:spPr>
+                    <a:xfrm>
+                      <a:off x="0" y="0"/>
+                      <a:ext cx="5486400" cy="8113871"/>
+                    </a:xfrm>
+                    <a:prstGeom prst="rect"/>
+                  </pic:spPr>
+                </pic:pic>
+              </a:graphicData>
+            </a:graphic>
+          </wp:inline>
+        </w:drawing>
+      </w:r>
+    </w:p>
+    <w:p>
+      <w:pPr>
+        <w:jc w:val="center"/>
+      </w:pPr>
+      <w:r>
+        <w:rPr>
+          <w:i/>
+          <w:color w:val="475569"/>
+          <w:sz w:val="18"/>
+        </w:rPr>
+        <w:t>Figure 26.1: Home page with navigation to India dashboard, kids chat, global dashboard, and pitch.</w:t>
+      </w:r>
+    </w:p>
+    <w:p>
+      <w:pPr>
+        <w:pStyle w:val="ListBullet"/>
+      </w:pPr>
+      <w:r>
+        <w:t>Marketing angle: One platform, multiple entry points for schools (chat), CSR (India impact), researchers (global dashboard).</w:t>
+      </w:r>
+    </w:p>
+    <w:p>
+      <w:pPr>
+        <w:pStyle w:val="ListBullet"/>
+      </w:pPr>
+      <w:r>
+        <w:t>Key message: Open source, agentic AI, 37 India regions, 65 global countries.</w:t>
+      </w:r>
+    </w:p>
+    <w:p>
+      <w:pPr>
+        <w:pStyle w:val="ListBullet"/>
+      </w:pPr>
+      <w:r>
+        <w:t>Call-to-action: Direct stakeholders to the surface most relevant to their use case.</w:t>
+      </w:r>
+    </w:p>
+    <w:p>
+      <w:pPr>
+        <w:pStyle w:val="Heading2"/>
+      </w:pPr>
+      <w:r>
+        <w:rPr>
+          <w:color w:val="0EA5E9"/>
+        </w:rPr>
+        <w:t>26.2 Global Climate-Health Dashboard</w:t>
+      </w:r>
+    </w:p>
+    <w:p>
+      <w:pPr>
+        <w:jc w:val="center"/>
+      </w:pPr>
+      <w:r>
+        <w:drawing>
+          <wp:inline xmlns:a="http://schemas.openxmlformats.org/drawingml/2006/main" xmlns:pic="http://schemas.openxmlformats.org/drawingml/2006/picture">
+            <wp:extent cx="5486400" cy="3857625"/>
+            <wp:docPr id="3" name="Picture 3"/>
+            <wp:cNvGraphicFramePr>
+              <a:graphicFrameLocks noChangeAspect="1"/>
+            </wp:cNvGraphicFramePr>
+            <a:graphic>
+              <a:graphicData uri="http://schemas.openxmlformats.org/drawingml/2006/picture">
+                <pic:pic>
+                  <pic:nvPicPr>
+                    <pic:cNvPr id="0" name="screenshot_dashboard.png"/>
+                    <pic:cNvPicPr/>
+                  </pic:nvPicPr>
+                  <pic:blipFill>
+                    <a:blip r:embed="rId12"/>
+                    <a:stretch>
+                      <a:fillRect/>
+                    </a:stretch>
+                  </pic:blipFill>
+                  <pic:spPr>
+                    <a:xfrm>
+                      <a:off x="0" y="0"/>
+                      <a:ext cx="5486400" cy="3857625"/>
+                    </a:xfrm>
+                    <a:prstGeom prst="rect"/>
+                  </pic:spPr>
+                </pic:pic>
+              </a:graphicData>
+            </a:graphic>
+          </wp:inline>
+        </w:drawing>
+      </w:r>
+    </w:p>
+    <w:p>
+      <w:pPr>
+        <w:jc w:val="center"/>
+      </w:pPr>
+      <w:r>
+        <w:rPr>
+          <w:i/>
+          <w:color w:val="475569"/>
+          <w:sz w:val="18"/>
+        </w:rPr>
+        <w:t>Figure 26.2: Global dashboard with country selector and six-agent pipeline analysis.</w:t>
+      </w:r>
+    </w:p>
+    <w:p>
+      <w:pPr>
+        <w:pStyle w:val="ListBullet"/>
+      </w:pPr>
+      <w:r>
+        <w:t>Demonstrates live Open-Meteo integration — no API key required for demo.</w:t>
+      </w:r>
+    </w:p>
+    <w:p>
+      <w:pPr>
+        <w:pStyle w:val="ListBullet"/>
+      </w:pPr>
+      <w:r>
+        <w:t>Six global agents produce child-ready guidance for 65 climate-vulnerable countries.</w:t>
+      </w:r>
+    </w:p>
+    <w:p>
+      <w:pPr>
+        <w:pStyle w:val="ListBullet"/>
+      </w:pPr>
+      <w:r>
+        <w:t>For India, links to dedicated CHIS dashboard with two additional regional agents.</w:t>
+      </w:r>
+    </w:p>
+    <w:p>
+      <w:pPr>
+        <w:pStyle w:val="Heading2"/>
+      </w:pPr>
+      <w:r>
+        <w:rPr>
+          <w:color w:val="0EA5E9"/>
+        </w:rPr>
+        <w:t>26.3 India Child Health Impact Dashboard</w:t>
+      </w:r>
+    </w:p>
+    <w:p>
+      <w:pPr>
+        <w:jc w:val="center"/>
+      </w:pPr>
+      <w:r>
+        <w:drawing>
+          <wp:inline xmlns:a="http://schemas.openxmlformats.org/drawingml/2006/main" xmlns:pic="http://schemas.openxmlformats.org/drawingml/2006/picture">
+            <wp:extent cx="5486400" cy="4410551"/>
+            <wp:docPr id="4" name="Picture 4"/>
+            <wp:cNvGraphicFramePr>
+              <a:graphicFrameLocks noChangeAspect="1"/>
+            </wp:cNvGraphicFramePr>
+            <a:graphic>
+              <a:graphicData uri="http://schemas.openxmlformats.org/drawingml/2006/picture">
+                <pic:pic>
+                  <pic:nvPicPr>
+                    <pic:cNvPr id="0" name="screenshot_india.png"/>
+                    <pic:cNvPicPr/>
+                  </pic:nvPicPr>
+                  <pic:blipFill>
+                    <a:blip r:embed="rId13"/>
+                    <a:stretch>
+                      <a:fillRect/>
+                    </a:stretch>
+                  </pic:blipFill>
+                  <pic:spPr>
+                    <a:xfrm>
+                      <a:off x="0" y="0"/>
+                      <a:ext cx="5486400" cy="4410551"/>
+                    </a:xfrm>
+                    <a:prstGeom prst="rect"/>
+                  </pic:spPr>
+                </pic:pic>
+              </a:graphicData>
+            </a:graphic>
+          </wp:inline>
+        </w:drawing>
+      </w:r>
+    </w:p>
+    <w:p>
+      <w:pPr>
+        <w:jc w:val="center"/>
+      </w:pPr>
+      <w:r>
+        <w:rPr>
+          <w:i/>
+          <w:color w:val="475569"/>
+          <w:sz w:val="18"/>
+        </w:rPr>
+        <w:t>Figure 26.3: India dashboard measuring CHIS across 37 Tier 1–3 regions.</w:t>
+      </w:r>
+    </w:p>
+    <w:p>
+      <w:pPr>
+        <w:pStyle w:val="ListBullet"/>
+      </w:pPr>
+      <w:r>
+        <w:t>Primary demo surface for Indian school groups, NGOs, CSR, and government stakeholders.</w:t>
+      </w:r>
+    </w:p>
+    <w:p>
+      <w:pPr>
+        <w:pStyle w:val="ListBullet"/>
+      </w:pPr>
+      <w:r>
+        <w:t>Shows composite CHIS score plus five dimension breakdowns with methodology notes.</w:t>
+      </w:r>
+    </w:p>
+    <w:p>
+      <w:pPr>
+        <w:pStyle w:val="ListBullet"/>
+      </w:pPr>
+      <w:r>
+        <w:t>References IMD, CPCB, NFHS-5, and NVBDCP — cite these for credibility with researchers.</w:t>
+      </w:r>
+    </w:p>
+    <w:p>
+      <w:pPr>
+        <w:pStyle w:val="Heading2"/>
+      </w:pPr>
+      <w:r>
+        <w:rPr>
+          <w:color w:val="0EA5E9"/>
+        </w:rPr>
+        <w:t>26.4 Kids Health Chat</w:t>
+      </w:r>
+    </w:p>
+    <w:p>
+      <w:pPr>
+        <w:jc w:val="center"/>
+      </w:pPr>
+      <w:r>
+        <w:drawing>
+          <wp:inline xmlns:a="http://schemas.openxmlformats.org/drawingml/2006/main" xmlns:pic="http://schemas.openxmlformats.org/drawingml/2006/picture">
+            <wp:extent cx="5486400" cy="5426392"/>
+            <wp:docPr id="5" name="Picture 5"/>
+            <wp:cNvGraphicFramePr>
+              <a:graphicFrameLocks noChangeAspect="1"/>
+            </wp:cNvGraphicFramePr>
+            <a:graphic>
+              <a:graphicData uri="http://schemas.openxmlformats.org/drawingml/2006/picture">
+                <pic:pic>
+                  <pic:nvPicPr>
+                    <pic:cNvPr id="0" name="screenshot_chat.png"/>
+                    <pic:cNvPicPr/>
+                  </pic:nvPicPr>
+                  <pic:blipFill>
+                    <a:blip r:embed="rId14"/>
+                    <a:stretch>
+                      <a:fillRect/>
+                    </a:stretch>
+                  </pic:blipFill>
+                  <pic:spPr>
+                    <a:xfrm>
+                      <a:off x="0" y="0"/>
+                      <a:ext cx="5486400" cy="5426392"/>
+                    </a:xfrm>
+                    <a:prstGeom prst="rect"/>
+                  </pic:spPr>
+                </pic:pic>
+              </a:graphicData>
+            </a:graphic>
+          </wp:inline>
+        </w:drawing>
+      </w:r>
+    </w:p>
+    <w:p>
+      <w:pPr>
+        <w:jc w:val="center"/>
+      </w:pPr>
+      <w:r>
+        <w:rPr>
+          <w:i/>
+          <w:color w:val="475569"/>
+          <w:sz w:val="18"/>
+        </w:rPr>
+        <w:t>Figure 26.4: Age-banded kids health chat with privacy safeguards.</w:t>
+      </w:r>
+    </w:p>
+    <w:p>
+      <w:pPr>
+        <w:pStyle w:val="ListBullet"/>
+      </w:pPr>
+      <w:r>
+        <w:t>Age bands: 5–8, 9–12, 13–17 — answers adapt to reading level and complexity.</w:t>
+      </w:r>
+    </w:p>
+    <w:p>
+      <w:pPr>
+        <w:pStyle w:val="ListBullet"/>
+      </w:pPr>
+      <w:r>
+        <w:t>Privacy-first: browser session only, no child accounts required for demo.</w:t>
+      </w:r>
+    </w:p>
+    <w:p>
+      <w:pPr>
+        <w:pStyle w:val="ListBullet"/>
+      </w:pPr>
+      <w:r>
+        <w:t>Consultant scheduling available — position as escalation path, not replacement for clinical care.</w:t>
+      </w:r>
+    </w:p>
+    <w:p>
+      <w:pPr>
+        <w:pStyle w:val="Heading2"/>
+      </w:pPr>
+      <w:r>
+        <w:rPr>
+          <w:color w:val="0EA5E9"/>
+        </w:rPr>
+        <w:t>26.5 Product Pitch Page</w:t>
+      </w:r>
+    </w:p>
+    <w:p>
+      <w:pPr>
+        <w:jc w:val="center"/>
+      </w:pPr>
+      <w:r>
+        <w:drawing>
+          <wp:inline xmlns:a="http://schemas.openxmlformats.org/drawingml/2006/main" xmlns:pic="http://schemas.openxmlformats.org/drawingml/2006/picture">
+            <wp:extent cx="5486400" cy="8765381"/>
+            <wp:docPr id="6" name="Picture 6"/>
+            <wp:cNvGraphicFramePr>
+              <a:graphicFrameLocks noChangeAspect="1"/>
+            </wp:cNvGraphicFramePr>
+            <a:graphic>
+              <a:graphicData uri="http://schemas.openxmlformats.org/drawingml/2006/picture">
+                <pic:pic>
+                  <pic:nvPicPr>
+                    <pic:cNvPr id="0" name="screenshot_pitch.png"/>
+                    <pic:cNvPicPr/>
+                  </pic:nvPicPr>
+                  <pic:blipFill>
+                    <a:blip r:embed="rId15"/>
+                    <a:stretch>
+                      <a:fillRect/>
+                    </a:stretch>
+                  </pic:blipFill>
+                  <pic:spPr>
+                    <a:xfrm>
+                      <a:off x="0" y="0"/>
+                      <a:ext cx="5486400" cy="8765381"/>
+                    </a:xfrm>
+                    <a:prstGeom prst="rect"/>
+                  </pic:spPr>
+                </pic:pic>
+              </a:graphicData>
+            </a:graphic>
+          </wp:inline>
+        </w:drawing>
+      </w:r>
+    </w:p>
+    <w:p>
+      <w:pPr>
+        <w:jc w:val="center"/>
+      </w:pPr>
+      <w:r>
+        <w:rPr>
+          <w:i/>
+          <w:color w:val="475569"/>
+          <w:sz w:val="18"/>
+        </w:rPr>
+        <w:t>Figure 26.5: Stakeholder-facing product overview with SDG alignment.</w:t>
+      </w:r>
+    </w:p>
+    <w:p>
+      <w:pPr>
+        <w:pStyle w:val="ListBullet"/>
+      </w:pPr>
+      <w:r>
+        <w:t>Use for pre-demo email attachments and association webinar follow-ups.</w:t>
+      </w:r>
+    </w:p>
+    <w:p>
+      <w:pPr>
+        <w:pStyle w:val="ListBullet"/>
+      </w:pPr>
+      <w:r>
+        <w:t>Covers problem, nine agents, safeguarding, and open-source positioning.</w:t>
+      </w:r>
+    </w:p>
+    <w:p>
+      <w:r>
+        <w:br w:type="page"/>
+      </w:r>
+    </w:p>
+    <w:p>
+      <w:pPr>
+        <w:pStyle w:val="Heading1"/>
+      </w:pPr>
+      <w:r>
+        <w:rPr>
+          <w:color w:val="0EA5E9"/>
+        </w:rPr>
+        <w:t>27. Nine AI Agents — Marketing Reference Guide</w:t>
+      </w:r>
+    </w:p>
+    <w:p>
+      <w:pPr>
+        <w:jc w:val="center"/>
+      </w:pPr>
+      <w:r>
+        <w:drawing>
+          <wp:inline xmlns:a="http://schemas.openxmlformats.org/drawingml/2006/main" xmlns:pic="http://schemas.openxmlformats.org/drawingml/2006/picture">
+            <wp:extent cx="5943600" cy="3445123"/>
+            <wp:docPr id="7" name="Picture 7"/>
+            <wp:cNvGraphicFramePr>
+              <a:graphicFrameLocks noChangeAspect="1"/>
+            </wp:cNvGraphicFramePr>
+            <a:graphic>
+              <a:graphicData uri="http://schemas.openxmlformats.org/drawingml/2006/picture">
+                <pic:pic>
+                  <pic:nvPicPr>
+                    <pic:cNvPr id="0" name="diagram_agent_architecture.png"/>
+                    <pic:cNvPicPr/>
+                  </pic:nvPicPr>
+                  <pic:blipFill>
+                    <a:blip r:embed="rId16"/>
+                    <a:stretch>
+                      <a:fillRect/>
+                    </a:stretch>
+                  </pic:blipFill>
+                  <pic:spPr>
+                    <a:xfrm>
+                      <a:off x="0" y="0"/>
+                      <a:ext cx="5943600" cy="3445123"/>
+                    </a:xfrm>
+                    <a:prstGeom prst="rect"/>
+                  </pic:spPr>
+                </pic:pic>
+              </a:graphicData>
+            </a:graphic>
+          </wp:inline>
+        </w:drawing>
+      </w:r>
+    </w:p>
+    <w:p>
+      <w:pPr>
+        <w:jc w:val="center"/>
+      </w:pPr>
+      <w:r>
+        <w:rPr>
+          <w:i/>
+          <w:color w:val="475569"/>
+          <w:sz w:val="18"/>
+        </w:rPr>
+        <w:t>Figure 27.1: Nine-agent architecture showing data flow from Open-Meteo to dashboards and chat.</w:t>
+      </w:r>
+    </w:p>
+    <w:p>
+      <w:r>
+        <w:t>Marketing professionals should be able to name all nine agents and explain each in one sentence. Do not overstate AI capabilities — agents organize, correlate, and explain; they do not diagnose.</w:t>
+      </w:r>
+    </w:p>
+    <w:tbl>
+      <w:tblPr>
+        <w:tblStyle w:val="TableGrid"/>
+        <w:tblW w:type="auto" w:w="0"/>
+        <w:tblLook w:firstColumn="1" w:firstRow="1" w:lastColumn="0" w:lastRow="0" w:noHBand="0" w:noVBand="1" w:val="04A0"/>
+      </w:tblPr>
+      <w:tblGrid>
+        <w:gridCol w:w="3408"/>
+        <w:gridCol w:w="3408"/>
+        <w:gridCol w:w="3408"/>
+      </w:tblGrid>
+      <w:tr>
+        <w:tc>
+          <w:tcPr>
+            <w:tcW w:type="dxa" w:w="3408"/>
+          </w:tcPr>
+          <w:p>
+            <w:r>
+              <w:t>Agent</w:t>
+            </w:r>
+          </w:p>
+        </w:tc>
+        <w:tc>
+          <w:tcPr>
+            <w:tcW w:type="dxa" w:w="3408"/>
+          </w:tcPr>
+          <w:p>
+            <w:r>
+              <w:t>One-Line Marketing Explanation</w:t>
+            </w:r>
+          </w:p>
+        </w:tc>
+        <w:tc>
+          <w:tcPr>
+            <w:tcW w:type="dxa" w:w="3408"/>
+          </w:tcPr>
+          <w:p>
+            <w:r>
+              <w:t>Primary Stakeholder</w:t>
+            </w:r>
+          </w:p>
+        </w:tc>
+      </w:tr>
+      <w:tr>
+        <w:tc>
+          <w:tcPr>
+            <w:tcW w:type="dxa" w:w="3408"/>
+          </w:tcPr>
+          <w:p>
+            <w:r>
+              <w:t>Climate Data Agent</w:t>
+            </w:r>
+          </w:p>
+        </w:tc>
+        <w:tc>
+          <w:tcPr>
+            <w:tcW w:type="dxa" w:w="3408"/>
+          </w:tcPr>
+          <w:p>
+            <w:r>
+              <w:t>Fetches live 7-day weather, heat index, and air quality from Open-Meteo.</w:t>
+            </w:r>
+          </w:p>
+        </w:tc>
+        <w:tc>
+          <w:tcPr>
+            <w:tcW w:type="dxa" w:w="3408"/>
+          </w:tcPr>
+          <w:p>
+            <w:r>
+              <w:t>All stakeholders</w:t>
+            </w:r>
+          </w:p>
+        </w:tc>
+      </w:tr>
+      <w:tr>
+        <w:tc>
+          <w:tcPr>
+            <w:tcW w:type="dxa" w:w="3408"/>
+          </w:tcPr>
+          <w:p>
+            <w:r>
+              <w:t>Health Risk Agent</w:t>
+            </w:r>
+          </w:p>
+        </w:tc>
+        <w:tc>
+          <w:tcPr>
+            <w:tcW w:type="dxa" w:w="3408"/>
+          </w:tcPr>
+          <w:p>
+            <w:r>
+              <w:t>Maps heat stress, respiratory, flood, and vector alerts using WHO-aligned heuristics.</w:t>
+            </w:r>
+          </w:p>
+        </w:tc>
+        <w:tc>
+          <w:tcPr>
+            <w:tcW w:type="dxa" w:w="3408"/>
+          </w:tcPr>
+          <w:p>
+            <w:r>
+              <w:t>Schools, public health</w:t>
+            </w:r>
+          </w:p>
+        </w:tc>
+      </w:tr>
+      <w:tr>
+        <w:tc>
+          <w:tcPr>
+            <w:tcW w:type="dxa" w:w="3408"/>
+          </w:tcPr>
+          <w:p>
+            <w:r>
+              <w:t>Nutrition Agent</w:t>
+            </w:r>
+          </w:p>
+        </w:tc>
+        <w:tc>
+          <w:tcPr>
+            <w:tcW w:type="dxa" w:w="3408"/>
+          </w:tcPr>
+          <w:p>
+            <w:r>
+              <w:t>Assesses hydration needs, food safety, and climate-linked nutrition stress.</w:t>
+            </w:r>
+          </w:p>
+        </w:tc>
+        <w:tc>
+          <w:tcPr>
+            <w:tcW w:type="dxa" w:w="3408"/>
+          </w:tcPr>
+          <w:p>
+            <w:r>
+              <w:t>NGOs, CSR (nutrition programs)</w:t>
+            </w:r>
+          </w:p>
+        </w:tc>
+      </w:tr>
+      <w:tr>
+        <w:tc>
+          <w:tcPr>
+            <w:tcW w:type="dxa" w:w="3408"/>
+          </w:tcPr>
+          <w:p>
+            <w:r>
+              <w:t>Disease Outlook Agent</w:t>
+            </w:r>
+          </w:p>
+        </w:tc>
+        <w:tc>
+          <w:tcPr>
+            <w:tcW w:type="dxa" w:w="3408"/>
+          </w:tcPr>
+          <w:p>
+            <w:r>
+              <w:t>Surfaces waterborne, vector-borne, and heat illness preparedness context.</w:t>
+            </w:r>
+          </w:p>
+        </w:tc>
+        <w:tc>
+          <w:tcPr>
+            <w:tcW w:type="dxa" w:w="3408"/>
+          </w:tcPr>
+          <w:p>
+            <w:r>
+              <w:t>Public health, researchers</w:t>
+            </w:r>
+          </w:p>
+        </w:tc>
+      </w:tr>
+      <w:tr>
+        <w:tc>
+          <w:tcPr>
+            <w:tcW w:type="dxa" w:w="3408"/>
+          </w:tcPr>
+          <w:p>
+            <w:r>
+              <w:t>Natural Medicine Agent</w:t>
+            </w:r>
+          </w:p>
+        </w:tc>
+        <w:tc>
+          <w:tcPr>
+            <w:tcW w:type="dxa" w:w="3408"/>
+          </w:tcPr>
+          <w:p>
+            <w:r>
+              <w:t>Evidence-tagged supportive remedies under caregiver supervision only.</w:t>
+            </w:r>
+          </w:p>
+        </w:tc>
+        <w:tc>
+          <w:tcPr>
+            <w:tcW w:type="dxa" w:w="3408"/>
+          </w:tcPr>
+          <w:p>
+            <w:r>
+              <w:t>Community health, NGOs</w:t>
+            </w:r>
+          </w:p>
+        </w:tc>
+      </w:tr>
+      <w:tr>
+        <w:tc>
+          <w:tcPr>
+            <w:tcW w:type="dxa" w:w="3408"/>
+          </w:tcPr>
+          <w:p>
+            <w:r>
+              <w:t>Synthesis Agent</w:t>
+            </w:r>
+          </w:p>
+        </w:tc>
+        <w:tc>
+          <w:tcPr>
+            <w:tcW w:type="dxa" w:w="3408"/>
+          </w:tcPr>
+          <w:p>
+            <w:r>
+              <w:t>Correlates all agent outputs into age-banded guidance (ages 5–17).</w:t>
+            </w:r>
+          </w:p>
+        </w:tc>
+        <w:tc>
+          <w:tcPr>
+            <w:tcW w:type="dxa" w:w="3408"/>
+          </w:tcPr>
+          <w:p>
+            <w:r>
+              <w:t>Teachers, parents, schools</w:t>
+            </w:r>
+          </w:p>
+        </w:tc>
+      </w:tr>
+      <w:tr>
+        <w:tc>
+          <w:tcPr>
+            <w:tcW w:type="dxa" w:w="3408"/>
+          </w:tcPr>
+          <w:p>
+            <w:r>
+              <w:t>India Regional Context Agent</w:t>
+            </w:r>
+          </w:p>
+        </w:tc>
+        <w:tc>
+          <w:tcPr>
+            <w:tcW w:type="dxa" w:w="3408"/>
+          </w:tcPr>
+          <w:p>
+            <w:r>
+              <w:t>Interprets monsoon cycles and zone-specific vulnerability across 37 regions.</w:t>
+            </w:r>
+          </w:p>
+        </w:tc>
+        <w:tc>
+          <w:tcPr>
+            <w:tcW w:type="dxa" w:w="3408"/>
+          </w:tcPr>
+          <w:p>
+            <w:r>
+              <w:t>Government, India CSR</w:t>
+            </w:r>
+          </w:p>
+        </w:tc>
+      </w:tr>
+      <w:tr>
+        <w:tc>
+          <w:tcPr>
+            <w:tcW w:type="dxa" w:w="3408"/>
+          </w:tcPr>
+          <w:p>
+            <w:r>
+              <w:t>India Child Health Impact Agent</w:t>
+            </w:r>
+          </w:p>
+        </w:tc>
+        <w:tc>
+          <w:tcPr>
+            <w:tcW w:type="dxa" w:w="3408"/>
+          </w:tcPr>
+          <w:p>
+            <w:r>
+              <w:t>Computes transparent CHIS score (0–100) across five dimensions.</w:t>
+            </w:r>
+          </w:p>
+        </w:tc>
+        <w:tc>
+          <w:tcPr>
+            <w:tcW w:type="dxa" w:w="3408"/>
+          </w:tcPr>
+          <w:p>
+            <w:r>
+              <w:t>Researchers, CSR, policy</w:t>
+            </w:r>
+          </w:p>
+        </w:tc>
+      </w:tr>
+      <w:tr>
+        <w:tc>
+          <w:tcPr>
+            <w:tcW w:type="dxa" w:w="3408"/>
+          </w:tcPr>
+          <w:p>
+            <w:r>
+              <w:t>Kids Health Chat Agent</w:t>
+            </w:r>
+          </w:p>
+        </w:tc>
+        <w:tc>
+          <w:tcPr>
+            <w:tcW w:type="dxa" w:w="3408"/>
+          </w:tcPr>
+          <w:p>
+            <w:r>
+              <w:t>Conversational Q&amp;A with privacy filtering and consultant scheduling.</w:t>
+            </w:r>
+          </w:p>
+        </w:tc>
+        <w:tc>
+          <w:tcPr>
+            <w:tcW w:type="dxa" w:w="3408"/>
+          </w:tcPr>
+          <w:p>
+            <w:r>
+              <w:t>Schools, parents</w:t>
+            </w:r>
+          </w:p>
+        </w:tc>
+      </w:tr>
+    </w:tbl>
+    <w:p>
+      <w:r>
+        <w:br w:type="page"/>
+      </w:r>
+    </w:p>
+    <w:p>
+      <w:pPr>
+        <w:pStyle w:val="Heading1"/>
+      </w:pPr>
+      <w:r>
+        <w:rPr>
+          <w:color w:val="0EA5E9"/>
+        </w:rPr>
+        <w:t>28. Child Health Impact Score (CHIS) — Deep Context</w:t>
+      </w:r>
+    </w:p>
+    <w:p>
+      <w:pPr>
+        <w:jc w:val="center"/>
+      </w:pPr>
+      <w:r>
+        <w:drawing>
+          <wp:inline xmlns:a="http://schemas.openxmlformats.org/drawingml/2006/main" xmlns:pic="http://schemas.openxmlformats.org/drawingml/2006/picture">
+            <wp:extent cx="5943600" cy="2691076"/>
+            <wp:docPr id="8" name="Picture 8"/>
+            <wp:cNvGraphicFramePr>
+              <a:graphicFrameLocks noChangeAspect="1"/>
+            </wp:cNvGraphicFramePr>
+            <a:graphic>
+              <a:graphicData uri="http://schemas.openxmlformats.org/drawingml/2006/picture">
+                <pic:pic>
+                  <pic:nvPicPr>
+                    <pic:cNvPr id="0" name="diagram_chis_dimensions.png"/>
+                    <pic:cNvPicPr/>
+                  </pic:nvPicPr>
+                  <pic:blipFill>
+                    <a:blip r:embed="rId17"/>
+                    <a:stretch>
+                      <a:fillRect/>
+                    </a:stretch>
+                  </pic:blipFill>
+                  <pic:spPr>
+                    <a:xfrm>
+                      <a:off x="0" y="0"/>
+                      <a:ext cx="5943600" cy="2691076"/>
+                    </a:xfrm>
+                    <a:prstGeom prst="rect"/>
+                  </pic:spPr>
+                </pic:pic>
+              </a:graphicData>
+            </a:graphic>
+          </wp:inline>
+        </w:drawing>
+      </w:r>
+    </w:p>
+    <w:p>
+      <w:pPr>
+        <w:jc w:val="center"/>
+      </w:pPr>
+      <w:r>
+        <w:rPr>
+          <w:i/>
+          <w:color w:val="475569"/>
+          <w:sz w:val="18"/>
+        </w:rPr>
+        <w:t>Figure 28.1: CHIS composite weights and example dimension scores.</w:t>
+      </w:r>
+    </w:p>
+    <w:p>
+      <w:r>
+        <w:t>The CHIS (Child Health Impact Score) is a 0–100 composite index where higher scores indicate greater climate-related health burden for children in a given region. All formulas are open-source and transparent in the codebase.</w:t>
+      </w:r>
+    </w:p>
+    <w:p>
+      <w:pPr>
+        <w:pStyle w:val="ListBullet"/>
+      </w:pPr>
+      <w:r>
+        <w:t>CHVI (25%): Child Heat Vulnerability Index — IMD heatwave thresholds, days above 38°C/42°C, aridity factor.</w:t>
+      </w:r>
+    </w:p>
+    <w:p>
+      <w:pPr>
+        <w:pStyle w:val="ListBullet"/>
+      </w:pPr>
+      <w:r>
+        <w:t>CRBS (20%): Child Respiratory Burden Score — AQI exposure, PM2.5/PM10, CPCB category weighting.</w:t>
+      </w:r>
+    </w:p>
+    <w:p>
+      <w:pPr>
+        <w:pStyle w:val="ListBullet"/>
+      </w:pPr>
+      <w:r>
+        <w:t>WDPI (20%): Waterborne Disease Pressure Index — precipitation, monsoon seasonality, flood risk.</w:t>
+      </w:r>
+    </w:p>
+    <w:p>
+      <w:pPr>
+        <w:pStyle w:val="ListBullet"/>
+      </w:pPr>
+      <w:r>
+        <w:t>VBDP (20%): Vector-Borne Disease Pressure — temperature-humidity-rainfall vector suitability (NVBDCP-aligned).</w:t>
+      </w:r>
+    </w:p>
+    <w:p>
+      <w:pPr>
+        <w:pStyle w:val="ListBullet"/>
+      </w:pPr>
+      <w:r>
+        <w:t>CNSI (15%): Climate Nutrition Stress Index — heat/flood/drought signals, mid-day meal disruption risk.</w:t>
+      </w:r>
+    </w:p>
+    <w:p>
+      <w:r>
+        <w:t>Approved marketing language: 'CHIS helps prioritize regional preparedness discussions.' Avoid: 'CHIS predicts which children will get sick.' Scores reflect regional context, not individual outcomes.</w:t>
+      </w:r>
+    </w:p>
+    <w:p>
+      <w:pPr>
+        <w:pStyle w:val="Heading1"/>
+      </w:pPr>
+      <w:r>
+        <w:rPr>
+          <w:color w:val="0EA5E9"/>
+        </w:rPr>
+        <w:t>29. India Regional Coverage Map</w:t>
+      </w:r>
+    </w:p>
+    <w:p>
+      <w:pPr>
+        <w:jc w:val="center"/>
+      </w:pPr>
+      <w:r>
+        <w:drawing>
+          <wp:inline xmlns:a="http://schemas.openxmlformats.org/drawingml/2006/main" xmlns:pic="http://schemas.openxmlformats.org/drawingml/2006/picture">
+            <wp:extent cx="5943600" cy="2673256"/>
+            <wp:docPr id="9" name="Picture 9"/>
+            <wp:cNvGraphicFramePr>
+              <a:graphicFrameLocks noChangeAspect="1"/>
+            </wp:cNvGraphicFramePr>
+            <a:graphic>
+              <a:graphicData uri="http://schemas.openxmlformats.org/drawingml/2006/picture">
+                <pic:pic>
+                  <pic:nvPicPr>
+                    <pic:cNvPr id="0" name="diagram_india_coverage.png"/>
+                    <pic:cNvPicPr/>
+                  </pic:nvPicPr>
+                  <pic:blipFill>
+                    <a:blip r:embed="rId18"/>
+                    <a:stretch>
+                      <a:fillRect/>
+                    </a:stretch>
+                  </pic:blipFill>
+                  <pic:spPr>
+                    <a:xfrm>
+                      <a:off x="0" y="0"/>
+                      <a:ext cx="5943600" cy="2673256"/>
+                    </a:xfrm>
+                    <a:prstGeom prst="rect"/>
+                  </pic:spPr>
+                </pic:pic>
+              </a:graphicData>
+            </a:graphic>
+          </wp:inline>
+        </w:drawing>
+      </w:r>
+    </w:p>
+    <w:p>
+      <w:pPr>
+        <w:jc w:val="center"/>
+      </w:pPr>
+      <w:r>
+        <w:rPr>
+          <w:i/>
+          <w:color w:val="475569"/>
+          <w:sz w:val="18"/>
+        </w:rPr>
+        <w:t>Figure 29.1: 37 Indian regions organized by tier for targeted outreach.</w:t>
+      </w:r>
+    </w:p>
+    <w:p>
+      <w:r>
+        <w:t>When prospecting, match tier to stakeholder size: Tier 1 for large school networks and metro CSR; Tier 2 for state-level NGOs and regional government; Tier 3 for community programs and district pilots.</w:t>
+      </w:r>
+    </w:p>
+    <w:p>
+      <w:pPr>
+        <w:pStyle w:val="Heading1"/>
+      </w:pPr>
+      <w:r>
+        <w:rPr>
+          <w:color w:val="0EA5E9"/>
+        </w:rPr>
+        <w:t>30. 15-Minute Marketing Demo Script</w:t>
+      </w:r>
+    </w:p>
+    <w:p>
+      <w:pPr>
+        <w:jc w:val="center"/>
+      </w:pPr>
+      <w:r>
+        <w:drawing>
+          <wp:inline xmlns:a="http://schemas.openxmlformats.org/drawingml/2006/main" xmlns:pic="http://schemas.openxmlformats.org/drawingml/2006/picture">
+            <wp:extent cx="5943600" cy="1549056"/>
+            <wp:docPr id="10" name="Picture 10"/>
+            <wp:cNvGraphicFramePr>
+              <a:graphicFrameLocks noChangeAspect="1"/>
+            </wp:cNvGraphicFramePr>
+            <a:graphic>
+              <a:graphicData uri="http://schemas.openxmlformats.org/drawingml/2006/picture">
+                <pic:pic>
+                  <pic:nvPicPr>
+                    <pic:cNvPr id="0" name="diagram_product_flow.png"/>
+                    <pic:cNvPicPr/>
+                  </pic:nvPicPr>
+                  <pic:blipFill>
+                    <a:blip r:embed="rId19"/>
+                    <a:stretch>
+                      <a:fillRect/>
+                    </a:stretch>
+                  </pic:blipFill>
+                  <pic:spPr>
+                    <a:xfrm>
+                      <a:off x="0" y="0"/>
+                      <a:ext cx="5943600" cy="1549056"/>
+                    </a:xfrm>
+                    <a:prstGeom prst="rect"/>
+                  </pic:spPr>
+                </pic:pic>
+              </a:graphicData>
+            </a:graphic>
+          </wp:inline>
+        </w:drawing>
+      </w:r>
+    </w:p>
+    <w:p>
+      <w:pPr>
+        <w:jc w:val="center"/>
+      </w:pPr>
+      <w:r>
+        <w:rPr>
+          <w:i/>
+          <w:color w:val="475569"/>
+          <w:sz w:val="18"/>
+        </w:rPr>
+        <w:t>Figure 30.1: End-to-end product flow from data sources to stakeholder action.</w:t>
+      </w:r>
+    </w:p>
+    <w:p>
+      <w:r>
+        <w:rPr>
+          <w:b/>
+        </w:rPr>
+        <w:t xml:space="preserve">Minutes 0–3: Discovery: </w:t>
+      </w:r>
+      <w:r>
+        <w:t>Ask: Who are your children/students? Which geography? What climate-health concerns matter most? Do not demo until you understand their context.</w:t>
+      </w:r>
+    </w:p>
+    <w:p>
+      <w:r>
+        <w:rPr>
+          <w:b/>
+        </w:rPr>
+        <w:t xml:space="preserve">Minutes 3–7: India Dashboard: </w:t>
+      </w:r>
+      <w:r>
+        <w:t>Select their nearest region. Run analysis. Walk through CHIS score and top two dimensions. Explain methodology transparency.</w:t>
+      </w:r>
+    </w:p>
+    <w:p>
+      <w:r>
+        <w:rPr>
+          <w:b/>
+        </w:rPr>
+        <w:t xml:space="preserve">Minutes 7–10: Age-Banded Guidance: </w:t>
+      </w:r>
+      <w:r>
+        <w:t>Show synthesis output for their target age band. Emphasize preparedness, not prediction.</w:t>
+      </w:r>
+    </w:p>
+    <w:p>
+      <w:r>
+        <w:rPr>
+          <w:b/>
+        </w:rPr>
+        <w:t xml:space="preserve">Minutes 10–12: Kids Chat (optional): </w:t>
+      </w:r>
+      <w:r>
+        <w:t>Demo age-appropriate Q&amp;A. Highlight privacy and safeguarding.</w:t>
+      </w:r>
+    </w:p>
+    <w:p>
+      <w:r>
+        <w:rPr>
+          <w:b/>
+        </w:rPr>
+        <w:t xml:space="preserve">Minutes 12–15: Next Steps: </w:t>
+      </w:r>
+      <w:r>
+        <w:t>Propose defined pilot: 10-school cohort, 90-day timeline, agreed outputs (monthly CHIS reports, teacher briefing cards).</w:t>
+      </w:r>
+    </w:p>
+    <w:p>
+      <w:pPr>
+        <w:pStyle w:val="Heading1"/>
+      </w:pPr>
+      <w:r>
+        <w:rPr>
+          <w:color w:val="0EA5E9"/>
+        </w:rPr>
+        <w:t>31. Competitive Differentiation</w:t>
+      </w:r>
+    </w:p>
+    <w:tbl>
+      <w:tblPr>
+        <w:tblStyle w:val="TableGrid"/>
+        <w:tblW w:type="auto" w:w="0"/>
+        <w:tblLook w:firstColumn="1" w:firstRow="1" w:lastColumn="0" w:lastRow="0" w:noHBand="0" w:noVBand="1" w:val="04A0"/>
+      </w:tblPr>
+      <w:tblGrid>
+        <w:gridCol w:w="3408"/>
+        <w:gridCol w:w="3408"/>
+        <w:gridCol w:w="3408"/>
+      </w:tblGrid>
+      <w:tr>
+        <w:tc>
+          <w:tcPr>
+            <w:tcW w:type="dxa" w:w="3408"/>
+          </w:tcPr>
+          <w:p>
+            <w:r>
+              <w:t>Capability</w:t>
+            </w:r>
+          </w:p>
+        </w:tc>
+        <w:tc>
+          <w:tcPr>
+            <w:tcW w:type="dxa" w:w="3408"/>
+          </w:tcPr>
+          <w:p>
+            <w:r>
+              <w:t>Weather App</w:t>
+            </w:r>
+          </w:p>
+        </w:tc>
+        <w:tc>
+          <w:tcPr>
+            <w:tcW w:type="dxa" w:w="3408"/>
+          </w:tcPr>
+          <w:p>
+            <w:r>
+              <w:t>KlimaGuard Kids</w:t>
+            </w:r>
+          </w:p>
+        </w:tc>
+      </w:tr>
+      <w:tr>
+        <w:tc>
+          <w:tcPr>
+            <w:tcW w:type="dxa" w:w="3408"/>
+          </w:tcPr>
+          <w:p>
+            <w:r>
+              <w:t>Child-centric framing</w:t>
+            </w:r>
+          </w:p>
+        </w:tc>
+        <w:tc>
+          <w:tcPr>
+            <w:tcW w:type="dxa" w:w="3408"/>
+          </w:tcPr>
+          <w:p>
+            <w:r>
+              <w:t>No</w:t>
+            </w:r>
+          </w:p>
+        </w:tc>
+        <w:tc>
+          <w:tcPr>
+            <w:tcW w:type="dxa" w:w="3408"/>
+          </w:tcPr>
+          <w:p>
+            <w:r>
+              <w:t>Yes — ages 5–17 guidance</w:t>
+            </w:r>
+          </w:p>
+        </w:tc>
+      </w:tr>
+      <w:tr>
+        <w:tc>
+          <w:tcPr>
+            <w:tcW w:type="dxa" w:w="3408"/>
+          </w:tcPr>
+          <w:p>
+            <w:r>
+              <w:t>Multi-domain correlation</w:t>
+            </w:r>
+          </w:p>
+        </w:tc>
+        <w:tc>
+          <w:tcPr>
+            <w:tcW w:type="dxa" w:w="3408"/>
+          </w:tcPr>
+          <w:p>
+            <w:r>
+              <w:t>No</w:t>
+            </w:r>
+          </w:p>
+        </w:tc>
+        <w:tc>
+          <w:tcPr>
+            <w:tcW w:type="dxa" w:w="3408"/>
+          </w:tcPr>
+          <w:p>
+            <w:r>
+              <w:t>Yes — health, nutrition, disease, climate</w:t>
+            </w:r>
+          </w:p>
+        </w:tc>
+      </w:tr>
+      <w:tr>
+        <w:tc>
+          <w:tcPr>
+            <w:tcW w:type="dxa" w:w="3408"/>
+          </w:tcPr>
+          <w:p>
+            <w:r>
+              <w:t>Regional impact scoring</w:t>
+            </w:r>
+          </w:p>
+        </w:tc>
+        <w:tc>
+          <w:tcPr>
+            <w:tcW w:type="dxa" w:w="3408"/>
+          </w:tcPr>
+          <w:p>
+            <w:r>
+              <w:t>No</w:t>
+            </w:r>
+          </w:p>
+        </w:tc>
+        <w:tc>
+          <w:tcPr>
+            <w:tcW w:type="dxa" w:w="3408"/>
+          </w:tcPr>
+          <w:p>
+            <w:r>
+              <w:t>Yes — CHIS across 37 India regions</w:t>
+            </w:r>
+          </w:p>
+        </w:tc>
+      </w:tr>
+      <w:tr>
+        <w:tc>
+          <w:tcPr>
+            <w:tcW w:type="dxa" w:w="3408"/>
+          </w:tcPr>
+          <w:p>
+            <w:r>
+              <w:t>Transparent methodology</w:t>
+            </w:r>
+          </w:p>
+        </w:tc>
+        <w:tc>
+          <w:tcPr>
+            <w:tcW w:type="dxa" w:w="3408"/>
+          </w:tcPr>
+          <w:p>
+            <w:r>
+              <w:t>N/A</w:t>
+            </w:r>
+          </w:p>
+        </w:tc>
+        <w:tc>
+          <w:tcPr>
+            <w:tcW w:type="dxa" w:w="3408"/>
+          </w:tcPr>
+          <w:p>
+            <w:r>
+              <w:t>Yes — open-source MIT, formulas published</w:t>
+            </w:r>
+          </w:p>
+        </w:tc>
+      </w:tr>
+      <w:tr>
+        <w:tc>
+          <w:tcPr>
+            <w:tcW w:type="dxa" w:w="3408"/>
+          </w:tcPr>
+          <w:p>
+            <w:r>
+              <w:t>Age-banded chat</w:t>
+            </w:r>
+          </w:p>
+        </w:tc>
+        <w:tc>
+          <w:tcPr>
+            <w:tcW w:type="dxa" w:w="3408"/>
+          </w:tcPr>
+          <w:p>
+            <w:r>
+              <w:t>No</w:t>
+            </w:r>
+          </w:p>
+        </w:tc>
+        <w:tc>
+          <w:tcPr>
+            <w:tcW w:type="dxa" w:w="3408"/>
+          </w:tcPr>
+          <w:p>
+            <w:r>
+              <w:t>Yes — privacy-safe kids health Q&amp;A</w:t>
+            </w:r>
+          </w:p>
+        </w:tc>
+      </w:tr>
+    </w:tbl>
+    <w:p>
+      <w:pPr>
+        <w:pStyle w:val="Heading1"/>
+      </w:pPr>
+      <w:r>
+        <w:rPr>
+          <w:color w:val="0EA5E9"/>
+        </w:rPr>
+        <w:t>32. SDG &amp; CSR Alignment Talking Points</w:t>
+      </w:r>
+    </w:p>
+    <w:p>
+      <w:pPr>
+        <w:pStyle w:val="ListBullet"/>
+      </w:pPr>
+      <w:r>
+        <w:t>SDG 3 (Good Health): Anticipatory action for climate-sensitive child health risks.</w:t>
+      </w:r>
+    </w:p>
+    <w:p>
+      <w:pPr>
+        <w:pStyle w:val="ListBullet"/>
+      </w:pPr>
+      <w:r>
+        <w:t>SDG 13 (Climate Action): Child-centred early warning intelligence layer.</w:t>
+      </w:r>
+    </w:p>
+    <w:p>
+      <w:pPr>
+        <w:pStyle w:val="ListBullet"/>
+      </w:pPr>
+      <w:r>
+        <w:t>SDG 2 (Zero Hunger): Nutrition and food security inference during climate shocks.</w:t>
+      </w:r>
+    </w:p>
+    <w:p>
+      <w:pPr>
+        <w:pStyle w:val="ListBullet"/>
+      </w:pPr>
+      <w:r>
+        <w:t>SDG 4 (Quality Education): School-ready heat, flood, and air quality guidance for administrators.</w:t>
+      </w:r>
+    </w:p>
+    <w:p>
+      <w:pPr>
+        <w:pStyle w:val="ListBullet"/>
+      </w:pPr>
+      <w:r>
+        <w:t>CSR framing: Fund a measurable 10/25/50-school pilot with monthly CHIS reporting and teacher preparedness cards.</w:t>
+      </w:r>
+    </w:p>
+    <w:p>
+      <w:pPr>
+        <w:pStyle w:val="Heading1"/>
+      </w:pPr>
+      <w:r>
+        <w:rPr>
+          <w:color w:val="0EA5E9"/>
+        </w:rPr>
+        <w:t>33. Open Source &amp; Partnership Positioning</w:t>
+      </w:r>
+    </w:p>
+    <w:p>
+      <w:pPr>
+        <w:pStyle w:val="ListBullet"/>
+      </w:pPr>
+      <w:r>
+        <w:t>MIT License — free to use, modify, and distribute; lowers adoption friction for NGOs and researchers.</w:t>
+      </w:r>
+    </w:p>
+    <w:p>
+      <w:pPr>
+        <w:pStyle w:val="ListBullet"/>
+      </w:pPr>
+      <w:r>
+        <w:t>Transparent formulas in open codebase — invite technical review rather than asking stakeholders to trust black boxes.</w:t>
+      </w:r>
+    </w:p>
+    <w:p>
+      <w:pPr>
+        <w:pStyle w:val="ListBullet"/>
+      </w:pPr>
+      <w:r>
+        <w:t>Extensible via API: /api/analyze, /api/chat, /api/india/regions — supports integration with existing school or health systems.</w:t>
+      </w:r>
+    </w:p>
+    <w:p>
+      <w:pPr>
+        <w:pStyle w:val="ListBullet"/>
+      </w:pPr>
+      <w:r>
+        <w:t>Community contributions welcome: new regions, agents, language packs, offline modes.</w:t>
+      </w:r>
+    </w:p>
+    <w:p>
+      <w:pPr>
+        <w:pStyle w:val="ListBullet"/>
+      </w:pPr>
+      <w:r>
+        <w:t>Positioning: 'Intelligence layer you can inspect, adapt, and co-develop' — not a locked proprietary SaaS.</w:t>
+      </w:r>
+    </w:p>
+    <w:p>
+      <w:pPr>
+        <w:pStyle w:val="Heading1"/>
+      </w:pPr>
+      <w:r>
+        <w:rPr>
+          <w:color w:val="0EA5E9"/>
+        </w:rPr>
+        <w:t>34. Marketing Funnel Visual Reference</w:t>
+      </w:r>
+    </w:p>
+    <w:p>
+      <w:pPr>
+        <w:jc w:val="center"/>
+      </w:pPr>
+      <w:r>
+        <w:drawing>
+          <wp:inline xmlns:a="http://schemas.openxmlformats.org/drawingml/2006/main" xmlns:pic="http://schemas.openxmlformats.org/drawingml/2006/picture">
+            <wp:extent cx="4572000" cy="2264180"/>
+            <wp:docPr id="11" name="Picture 11"/>
+            <wp:cNvGraphicFramePr>
+              <a:graphicFrameLocks noChangeAspect="1"/>
+            </wp:cNvGraphicFramePr>
+            <a:graphic>
+              <a:graphicData uri="http://schemas.openxmlformats.org/drawingml/2006/picture">
+                <pic:pic>
+                  <pic:nvPicPr>
+                    <pic:cNvPr id="0" name="diagram_stakeholder_funnel.png"/>
+                    <pic:cNvPicPr/>
+                  </pic:nvPicPr>
+                  <pic:blipFill>
+                    <a:blip r:embed="rId20"/>
+                    <a:stretch>
+                      <a:fillRect/>
+                    </a:stretch>
+                  </pic:blipFill>
+                  <pic:spPr>
+                    <a:xfrm>
+                      <a:off x="0" y="0"/>
+                      <a:ext cx="4572000" cy="2264180"/>
+                    </a:xfrm>
+                    <a:prstGeom prst="rect"/>
+                  </pic:spPr>
+                </pic:pic>
+              </a:graphicData>
+            </a:graphic>
+          </wp:inline>
+        </w:drawing>
+      </w:r>
+    </w:p>
+    <w:p>
+      <w:pPr>
+        <w:jc w:val="center"/>
+      </w:pPr>
+      <w:r>
+        <w:rPr>
+          <w:i/>
+          <w:color w:val="475569"/>
+          <w:sz w:val="18"/>
+        </w:rPr>
+        <w:t>Figure 34.1: Standard funnel from awareness outreach to scale partnership.</w:t>
+      </w:r>
+    </w:p>
+    <w:p>
+      <w:r>
+        <w:t>Align every touchpoint to the funnel stage. Early emails should not ask for enterprise contracts; they should earn a 15-minute discovery call. Pilots must have defined outputs before scale conversations.</w:t>
+      </w:r>
+    </w:p>
+    <w:p>
+      <w:pPr>
+        <w:pStyle w:val="Heading1"/>
+      </w:pPr>
+      <w:r>
+        <w:rPr>
+          <w:color w:val="0EA5E9"/>
+        </w:rPr>
+        <w:t>35. Quick Reference Card — Trainer Handout</w:t>
+      </w:r>
+    </w:p>
+    <w:tbl>
+      <w:tblPr>
+        <w:tblStyle w:val="TableGrid"/>
+        <w:tblW w:type="auto" w:w="0"/>
+        <w:tblLook w:firstColumn="1" w:firstRow="1" w:lastColumn="0" w:lastRow="0" w:noHBand="0" w:noVBand="1" w:val="04A0"/>
+      </w:tblPr>
+      <w:tblGrid>
+        <w:gridCol w:w="5112"/>
+        <w:gridCol w:w="5112"/>
+      </w:tblGrid>
+      <w:tr>
+        <w:tc>
+          <w:tcPr>
+            <w:tcW w:type="dxa" w:w="5112"/>
+          </w:tcPr>
+          <w:p>
+            <w:r>
+              <w:t>Product type</w:t>
+            </w:r>
+          </w:p>
+        </w:tc>
+        <w:tc>
+          <w:tcPr>
+            <w:tcW w:type="dxa" w:w="5112"/>
+          </w:tcPr>
+          <w:p>
+            <w:r>
+              <w:t>Child-centric climate-health intelligence &amp; decision support</w:t>
+            </w:r>
+          </w:p>
+        </w:tc>
+      </w:tr>
+      <w:tr>
+        <w:tc>
+          <w:tcPr>
+            <w:tcW w:type="dxa" w:w="5112"/>
+          </w:tcPr>
+          <w:p>
+            <w:r>
+              <w:t>Not a</w:t>
+            </w:r>
+          </w:p>
+        </w:tc>
+        <w:tc>
+          <w:tcPr>
+            <w:tcW w:type="dxa" w:w="5112"/>
+          </w:tcPr>
+          <w:p>
+            <w:r>
+              <w:t>Medical diagnostic, treatment system, or individual disease predictor</w:t>
+            </w:r>
+          </w:p>
+        </w:tc>
+      </w:tr>
+      <w:tr>
+        <w:tc>
+          <w:tcPr>
+            <w:tcW w:type="dxa" w:w="5112"/>
+          </w:tcPr>
+          <w:p>
+            <w:r>
+              <w:t>Live demo URL paths</w:t>
+            </w:r>
+          </w:p>
+        </w:tc>
+        <w:tc>
+          <w:tcPr>
+            <w:tcW w:type="dxa" w:w="5112"/>
+          </w:tcPr>
+          <w:p>
+            <w:r>
+              <w:t>/ · /india · /dashboard · /chat · /pitch</w:t>
+            </w:r>
+          </w:p>
+        </w:tc>
+      </w:tr>
+      <w:tr>
+        <w:tc>
+          <w:tcPr>
+            <w:tcW w:type="dxa" w:w="5112"/>
+          </w:tcPr>
+          <w:p>
+            <w:r>
+              <w:t>India coverage</w:t>
+            </w:r>
+          </w:p>
+        </w:tc>
+        <w:tc>
+          <w:tcPr>
+            <w:tcW w:type="dxa" w:w="5112"/>
+          </w:tcPr>
+          <w:p>
+            <w:r>
+              <w:t>37 regions (8 Tier 1 · 19 Tier 2 · 10 Tier 3)</w:t>
+            </w:r>
+          </w:p>
+        </w:tc>
+      </w:tr>
+      <w:tr>
+        <w:tc>
+          <w:tcPr>
+            <w:tcW w:type="dxa" w:w="5112"/>
+          </w:tcPr>
+          <w:p>
+            <w:r>
+              <w:t>Global coverage</w:t>
+            </w:r>
+          </w:p>
+        </w:tc>
+        <w:tc>
+          <w:tcPr>
+            <w:tcW w:type="dxa" w:w="5112"/>
+          </w:tcPr>
+          <w:p>
+            <w:r>
+              <w:t>65 climate-vulnerable countries</w:t>
+            </w:r>
+          </w:p>
+        </w:tc>
+      </w:tr>
+      <w:tr>
+        <w:tc>
+          <w:tcPr>
+            <w:tcW w:type="dxa" w:w="5112"/>
+          </w:tcPr>
+          <w:p>
+            <w:r>
+              <w:t>AI agents</w:t>
+            </w:r>
+          </w:p>
+        </w:tc>
+        <w:tc>
+          <w:tcPr>
+            <w:tcW w:type="dxa" w:w="5112"/>
+          </w:tcPr>
+          <w:p>
+            <w:r>
+              <w:t>9 cooperating agents with transparent orchestration</w:t>
+            </w:r>
+          </w:p>
+        </w:tc>
+      </w:tr>
+      <w:tr>
+        <w:tc>
+          <w:tcPr>
+            <w:tcW w:type="dxa" w:w="5112"/>
+          </w:tcPr>
+          <w:p>
+            <w:r>
+              <w:t>Key score</w:t>
+            </w:r>
+          </w:p>
+        </w:tc>
+        <w:tc>
+          <w:tcPr>
+            <w:tcW w:type="dxa" w:w="5112"/>
+          </w:tcPr>
+          <w:p>
+            <w:r>
+              <w:t>CHIS 0–100 (higher = greater regional burden)</w:t>
+            </w:r>
+          </w:p>
+        </w:tc>
+      </w:tr>
+      <w:tr>
+        <w:tc>
+          <w:tcPr>
+            <w:tcW w:type="dxa" w:w="5112"/>
+          </w:tcPr>
+          <w:p>
+            <w:r>
+              <w:t>License</w:t>
+            </w:r>
+          </w:p>
+        </w:tc>
+        <w:tc>
+          <w:tcPr>
+            <w:tcW w:type="dxa" w:w="5112"/>
+          </w:tcPr>
+          <w:p>
+            <w:r>
+              <w:t>MIT Open Source</w:t>
+            </w:r>
+          </w:p>
+        </w:tc>
+      </w:tr>
+    </w:tbl>
     <w:sectPr>
       <w:footerReference w:type="default" r:id="rId9"/>
       <w:pgSz w:w="12240" w:h="15840"/>

</xml_diff>